<commit_message>
Update lab guide: Before You Start section, token steps, Unique ID desk card, Turbonomic simplified steps, Phase 5 optional, LiveNote details, remove Cluster Credentials
</commit_message>
<xml_diff>
--- a/2490-lab-guide.docx
+++ b/2490-lab-guide.docx
@@ -175,154 +175,59 @@
     </w:p>
     <w:p>
       <w:pPr>
+        <w:pStyle w:val="Heading1"/>
+        <w:spacing w:before="280" w:after="120"/>
+      </w:pPr>
+      <w:r>
+        <w:rPr>
+          <w:b/>
+          <w:sz w:val="32"/>
+        </w:rPr>
+        <w:t xml:space="preserve">Before You Start</w:t>
+      </w:r>
+    </w:p>
+    <w:p>
+      <w:pPr>
+        <w:spacing w:after="120"/>
+      </w:pPr>
+      <w:r>
+        <w:rPr>
+          <w:sz w:val="22"/>
+        </w:rPr>
+        <w:t xml:space="preserve">Before opening a terminal, confirm you have the following URLs and keys to hand. All values are posted on the shared LiveNote session — open it now and keep it available throughout the lab.</w:t>
+      </w:r>
+    </w:p>
+    <w:p>
+      <w:pPr>
+        <w:pBdr>
+          <w:top w:val="single" w:color="2E74B5" w:sz="4" w:space="4"/>
+          <w:left w:val="single" w:color="2E74B5" w:sz="4" w:space="4"/>
+          <w:bottom w:val="single" w:color="2E74B5" w:sz="4" w:space="4"/>
+          <w:right w:val="single" w:color="2E74B5" w:sz="4" w:space="4"/>
+          <w:between w:val="single" w:color="2E74B5" w:sz="4" w:space="4"/>
+        </w:pBdr>
+        <w:shd w:val="clear" w:fill="E8F4FD"/>
+        <w:spacing w:before="80" w:after="200"/>
+      </w:pPr>
+      <w:r>
+        <w:rPr>
+          <w:b/>
+          <w:sz w:val="22"/>
+        </w:rPr>
+        <w:t xml:space="preserve">LiveNote: https://livenote.in/s/wNyGI7chY8XQMNg4</w:t>
+      </w:r>
+    </w:p>
+    <w:p>
+      <w:pPr>
         <w:pStyle w:val="Heading2"/>
-        <w:spacing w:before="280" w:after="120"/>
-      </w:pPr>
-      <w:r>
-        <w:rPr>
-          <w:b/>
-          <w:color w:val="2E74B5"/>
+        <w:spacing w:before="200" w:after="80"/>
+      </w:pPr>
+      <w:r>
+        <w:rPr>
+          <w:b/>
           <w:sz w:val="26"/>
         </w:rPr>
-        <w:t xml:space="preserve">Prerequisites</w:t>
-      </w:r>
-    </w:p>
-    <w:p>
-      <w:pPr>
-        <w:pStyle w:val="Normal"/>
-        <w:numPr>
-          <w:ilvl w:val="0"/>
-          <w:numId w:val="2"/>
-        </w:numPr>
-        <w:spacing w:after="80"/>
-      </w:pPr>
-      <w:r>
-        <w:rPr>
-          <w:sz w:val="22"/>
-        </w:rPr>
-        <w:t xml:space="preserve">oc CLI installed (OpenShift CLI v4.x)</w:t>
-      </w:r>
-    </w:p>
-    <w:p>
-      <w:pPr>
-        <w:pStyle w:val="Normal"/>
-        <w:numPr>
-          <w:ilvl w:val="0"/>
-          <w:numId w:val="2"/>
-        </w:numPr>
-        <w:spacing w:after="80"/>
-      </w:pPr>
-      <w:r>
-        <w:rPr>
-          <w:sz w:val="22"/>
-        </w:rPr>
-        <w:t xml:space="preserve">helm CLI installed (v3.x)</w:t>
-      </w:r>
-    </w:p>
-    <w:p>
-      <w:pPr>
-        <w:pStyle w:val="Normal"/>
-        <w:numPr>
-          <w:ilvl w:val="0"/>
-          <w:numId w:val="2"/>
-        </w:numPr>
-        <w:spacing w:after="80"/>
-      </w:pPr>
-      <w:r>
-        <w:rPr>
-          <w:sz w:val="22"/>
-        </w:rPr>
-        <w:t xml:space="preserve">git installed</w:t>
-      </w:r>
-    </w:p>
-    <w:p>
-      <w:pPr>
-        <w:pStyle w:val="Normal"/>
-        <w:numPr>
-          <w:ilvl w:val="0"/>
-          <w:numId w:val="2"/>
-        </w:numPr>
-        <w:spacing w:after="320"/>
-      </w:pPr>
-      <w:r>
-        <w:rPr>
-          <w:sz w:val="22"/>
-        </w:rPr>
-        <w:t xml:space="preserve">Access to your TechZone lab environment (credentials provided below)</w:t>
-      </w:r>
-    </w:p>
-    <w:p>
-      <w:pPr>
-        <w:pStyle w:val="Heading2"/>
-        <w:spacing w:before="280" w:after="120"/>
-      </w:pPr>
-      <w:r>
-        <w:rPr>
-          <w:b/>
-          <w:color w:val="2E74B5"/>
-          <w:sz w:val="26"/>
-        </w:rPr>
-        <w:t xml:space="preserve">Your Unique ID (30 students share this cluster)</w:t>
-      </w:r>
-    </w:p>
-    <w:p>
-      <w:pPr>
-        <w:pStyle w:val="Normal"/>
-        <w:spacing w:after="120"/>
-      </w:pPr>
-      <w:r>
-        <w:rPr>
-          <w:sz w:val="22"/>
-        </w:rPr>
-        <w:t xml:space="preserve">Many students share this cluster, so every resource you create must have a unique name. Choose a short, lowercase ID (2–8 characters, letters and digits only, e.g. your initials plus a number such as ab07) and use it wherever you see &lt;YOUR-ID&gt; in this guide. Your instructor will assign IDs if you are unsure. Do not use another student's ID.</w:t>
-      </w:r>
-    </w:p>
-    <w:p>
-      <w:pPr>
-        <w:pStyle w:val="Normal"/>
-        <w:pBdr>
-          <w:top w:val="single" w:color="F4B942" w:sz="4" w:space="4"/>
-          <w:left w:val="single" w:color="F4B942" w:sz="4" w:space="4"/>
-          <w:bottom w:val="single" w:color="F4B942" w:sz="4" w:space="4"/>
-          <w:right w:val="single" w:color="F4B942" w:sz="4" w:space="4"/>
-          <w:between w:val="single" w:color="F4B942" w:sz="4" w:space="4"/>
-        </w:pBdr>
-        <w:shd w:val="clear" w:fill="FFF2CC"/>
-        <w:spacing w:before="200" w:after="200"/>
-      </w:pPr>
-      <w:r>
-        <w:rPr>
-          <w:b w:val="false"/>
-          <w:color w:val="7F6000"/>
-          <w:sz w:val="20"/>
-        </w:rPr>
-        <w:t xml:space="preserve">IMPORTANT: Replace &lt;YOUR-ID&gt; with your own ID in every command — for example, with ID ab07 the namespace is robot-shop-ab07 and the Helm release is robot-shop-ab07. Using the default names will collide with other students' resources.</w:t>
-      </w:r>
-    </w:p>
-    <w:p>
-      <w:pPr>
-        <w:pStyle w:val="Heading2"/>
-        <w:spacing w:before="280" w:after="120"/>
-      </w:pPr>
-      <w:r>
-        <w:rPr>
-          <w:b/>
-          <w:color w:val="2E74B5"/>
-          <w:sz w:val="26"/>
-        </w:rPr>
-        <w:t xml:space="preserve">Cluster Credentials</w:t>
-      </w:r>
-    </w:p>
-    <w:p>
-      <w:pPr>
-        <w:pStyle w:val="Normal"/>
-        <w:spacing w:after="120"/>
-      </w:pPr>
-      <w:r>
-        <w:rPr>
-          <w:sz w:val="22"/>
-        </w:rPr>
-        <w:t xml:space="preserve">Use the following credentials to access your TechZone OpenShift cluster throughout this lab:</w:t>
+        <w:t xml:space="preserve">URLs &amp; Endpoints</w:t>
       </w:r>
     </w:p>
     <w:tbl>
@@ -348,70 +253,341 @@
         <w:tc>
           <w:p>
             <w:r>
-              <w:t xml:space="preserve">Field</w:t>
-            </w:r>
-          </w:p>
-        </w:tc>
-        <w:tc>
-          <w:p>
-            <w:r>
-              <w:t xml:space="preserve">Value</w:t>
+              <w:t xml:space="preserve">What</w:t>
+            </w:r>
+          </w:p>
+        </w:tc>
+        <w:tc>
+          <w:p>
+            <w:r>
+              <w:t xml:space="preserve">URL / Value</w:t>
             </w:r>
           </w:p>
         </w:tc>
       </w:tr>
       <w:tr>
-        <w:trPr/>
-        <w:tc>
-          <w:p>
-            <w:r>
-              <w:t xml:space="preserve">API Server URL</w:t>
-            </w:r>
-          </w:p>
-        </w:tc>
-        <w:tc>
-          <w:p>
-            <w:r>
-              <w:t xml:space="preserve">https://api.itz-t53413.hub01-lb.techzone.ibm.com:6443</w:t>
+        <w:tc>
+          <w:p>
+            <w:r>
+              <w:t xml:space="preserve">OpenShift Web Console</w:t>
+            </w:r>
+          </w:p>
+        </w:tc>
+        <w:tc>
+          <w:p>
+            <w:r>
+              <w:t xml:space="preserve">&lt;provided on LiveNote&gt;</w:t>
             </w:r>
           </w:p>
         </w:tc>
       </w:tr>
       <w:tr>
-        <w:trPr/>
-        <w:tc>
-          <w:p>
-            <w:r>
-              <w:t xml:space="preserve">Login Token</w:t>
-            </w:r>
-          </w:p>
-        </w:tc>
-        <w:tc>
-          <w:p>
-            <w:r>
-              <w:t xml:space="preserve">sha256~bgSlQPxBYIiLOwXofwHmkAWZXx6r5BqJIAC0AzIJKTs</w:t>
+        <w:tc>
+          <w:p>
+            <w:r>
+              <w:t xml:space="preserve">OpenShift API Server URL</w:t>
+            </w:r>
+          </w:p>
+        </w:tc>
+        <w:tc>
+          <w:p>
+            <w:r>
+              <w:t xml:space="preserve">&lt;provided on LiveNote&gt;</w:t>
             </w:r>
           </w:p>
         </w:tc>
       </w:tr>
       <w:tr>
-        <w:trPr/>
-        <w:tc>
-          <w:p>
-            <w:r>
-              <w:t xml:space="preserve">Application URL</w:t>
-            </w:r>
-          </w:p>
-        </w:tc>
-        <w:tc>
-          <w:p>
-            <w:r>
-              <w:t xml:space="preserve">https://web-robot-shop.apps.itz-t53413.hub01-lb.techzone.ibm.com</w:t>
+        <w:tc>
+          <w:p>
+            <w:r>
+              <w:t xml:space="preserve">OpenShift Login Token</w:t>
+            </w:r>
+          </w:p>
+        </w:tc>
+        <w:tc>
+          <w:p>
+            <w:r>
+              <w:t xml:space="preserve">Generate from web console (see Step 1)</w:t>
+            </w:r>
+          </w:p>
+        </w:tc>
+      </w:tr>
+      <w:tr>
+        <w:tc>
+          <w:p>
+            <w:r>
+              <w:t xml:space="preserve">IBM Instana UI</w:t>
+            </w:r>
+          </w:p>
+        </w:tc>
+        <w:tc>
+          <w:p>
+            <w:r>
+              <w:t xml:space="preserve">&lt;provided on LiveNote&gt;</w:t>
+            </w:r>
+          </w:p>
+        </w:tc>
+      </w:tr>
+      <w:tr>
+        <w:tc>
+          <w:p>
+            <w:r>
+              <w:t xml:space="preserve">Instana Agent Key</w:t>
+            </w:r>
+          </w:p>
+        </w:tc>
+        <w:tc>
+          <w:p>
+            <w:r>
+              <w:t xml:space="preserve">&lt;provided on LiveNote&gt;</w:t>
+            </w:r>
+          </w:p>
+        </w:tc>
+      </w:tr>
+      <w:tr>
+        <w:tc>
+          <w:p>
+            <w:r>
+              <w:t xml:space="preserve">IBM Turbonomic UI</w:t>
+            </w:r>
+          </w:p>
+        </w:tc>
+        <w:tc>
+          <w:p>
+            <w:r>
+              <w:t xml:space="preserve">&lt;provided on LiveNote&gt;</w:t>
+            </w:r>
+          </w:p>
+        </w:tc>
+      </w:tr>
+      <w:tr>
+        <w:tc>
+          <w:p>
+            <w:r>
+              <w:t xml:space="preserve">IBM Cloudability UI</w:t>
+            </w:r>
+          </w:p>
+        </w:tc>
+        <w:tc>
+          <w:p>
+            <w:r>
+              <w:t xml:space="preserve">&lt;provided on LiveNote&gt;</w:t>
+            </w:r>
+          </w:p>
+        </w:tc>
+      </w:tr>
+      <w:tr>
+        <w:tc>
+          <w:p>
+            <w:r>
+              <w:t xml:space="preserve">Cloudability API Key</w:t>
+            </w:r>
+          </w:p>
+        </w:tc>
+        <w:tc>
+          <w:p>
+            <w:r>
+              <w:t xml:space="preserve">&lt;provided on LiveNote&gt;</w:t>
             </w:r>
           </w:p>
         </w:tc>
       </w:tr>
     </w:tbl>
+    <w:p>
+      <w:pPr>
+        <w:pStyle w:val="Heading2"/>
+        <w:spacing w:before="200" w:after="80"/>
+      </w:pPr>
+      <w:r>
+        <w:rPr>
+          <w:b/>
+          <w:sz w:val="26"/>
+        </w:rPr>
+        <w:t xml:space="preserve">How to get your OpenShift login token</w:t>
+      </w:r>
+    </w:p>
+    <w:p>
+      <w:pPr>
+        <w:spacing w:after="120"/>
+      </w:pPr>
+      <w:r>
+        <w:rPr>
+          <w:sz w:val="22"/>
+        </w:rPr>
+        <w:t xml:space="preserve">Each student must generate their own personal token from the OpenShift web console. Do not share tokens — they are tied to your session and expire.</w:t>
+      </w:r>
+    </w:p>
+    <w:p>
+      <w:pPr>
+        <w:spacing w:after="80"/>
+      </w:pPr>
+      <w:r>
+        <w:rPr>
+          <w:sz w:val="22"/>
+        </w:rPr>
+        <w:t xml:space="preserve">Step 1.  Open the OpenShift Web Console in your browser using the URL from LiveNote.</w:t>
+      </w:r>
+    </w:p>
+    <w:p>
+      <w:pPr>
+        <w:spacing w:after="80"/>
+      </w:pPr>
+      <w:r>
+        <w:rPr>
+          <w:sz w:val="22"/>
+        </w:rPr>
+        <w:t xml:space="preserve">Step 2.  Log in with the username and password provided on LiveNote. You should land on the OpenShift Overview or Home dashboard.</w:t>
+      </w:r>
+    </w:p>
+    <w:p>
+      <w:pPr>
+        <w:spacing w:after="80"/>
+      </w:pPr>
+      <w:r>
+        <w:rPr>
+          <w:sz w:val="22"/>
+        </w:rPr>
+        <w:t xml:space="preserve">Step 3.  In the top-right corner of the console, click your username (e.g. "kubeadmin" or your assigned user). A small dropdown appears — click Copy login command.</w:t>
+      </w:r>
+    </w:p>
+    <w:p>
+      <w:pPr>
+        <w:spacing w:after="80"/>
+      </w:pPr>
+      <w:r>
+        <w:rPr>
+          <w:sz w:val="22"/>
+        </w:rPr>
+        <w:t xml:space="preserve">Step 4.  A new browser tab opens. Click the Display Token link on that page.</w:t>
+      </w:r>
+    </w:p>
+    <w:p>
+      <w:pPr>
+        <w:spacing w:after="240"/>
+      </w:pPr>
+      <w:r>
+        <w:rPr>
+          <w:sz w:val="22"/>
+        </w:rPr>
+        <w:t xml:space="preserve">Step 5.  The page shows two things: your API token at the top, and a ready-made "Log in with this token" command below it. The command already contains both your token and the server URL — e.g.:    oc login --token=sha256~xxxx --server=https://api.&lt;cluster&gt;:6443    Copy that entire command. You will paste it directly into your terminal in Phase 1 Step 1.</w:t>
+      </w:r>
+    </w:p>
+    <w:p>
+      <w:pPr>
+        <w:pStyle w:val="Heading2"/>
+        <w:spacing w:before="280" w:after="120"/>
+      </w:pPr>
+      <w:r>
+        <w:rPr>
+          <w:b/>
+          <w:color w:val="2E74B5"/>
+          <w:sz w:val="26"/>
+        </w:rPr>
+        <w:t xml:space="preserve">Prerequisites</w:t>
+      </w:r>
+    </w:p>
+    <w:p>
+      <w:pPr>
+        <w:pStyle w:val="Normal"/>
+        <w:numPr>
+          <w:ilvl w:val="0"/>
+          <w:numId w:val="2"/>
+        </w:numPr>
+        <w:spacing w:after="80"/>
+      </w:pPr>
+      <w:r>
+        <w:rPr>
+          <w:sz w:val="22"/>
+        </w:rPr>
+        <w:t xml:space="preserve">oc CLI installed (OpenShift CLI v4.x)</w:t>
+      </w:r>
+    </w:p>
+    <w:p>
+      <w:pPr>
+        <w:pStyle w:val="Normal"/>
+        <w:numPr>
+          <w:ilvl w:val="0"/>
+          <w:numId w:val="2"/>
+        </w:numPr>
+        <w:spacing w:after="80"/>
+      </w:pPr>
+      <w:r>
+        <w:rPr>
+          <w:sz w:val="22"/>
+        </w:rPr>
+        <w:t xml:space="preserve">helm CLI installed (v3.x)</w:t>
+      </w:r>
+    </w:p>
+    <w:p>
+      <w:pPr>
+        <w:pStyle w:val="Normal"/>
+        <w:numPr>
+          <w:ilvl w:val="0"/>
+          <w:numId w:val="2"/>
+        </w:numPr>
+        <w:spacing w:after="80"/>
+      </w:pPr>
+      <w:r>
+        <w:rPr>
+          <w:sz w:val="22"/>
+        </w:rPr>
+        <w:t xml:space="preserve">git installed</w:t>
+      </w:r>
+    </w:p>
+    <w:p>
+      <w:pPr>
+        <w:pStyle w:val="Normal"/>
+        <w:numPr>
+          <w:ilvl w:val="0"/>
+          <w:numId w:val="2"/>
+        </w:numPr>
+        <w:spacing w:after="320"/>
+      </w:pPr>
+      <w:r>
+        <w:rPr>
+          <w:sz w:val="22"/>
+        </w:rPr>
+        <w:t xml:space="preserve">Access to your TechZone lab environment (credentials provided below)</w:t>
+      </w:r>
+    </w:p>
+    <w:p>
+      <w:pPr>
+        <w:spacing w:after="240"/>
+      </w:pPr>
+      <w:r>
+        <w:rPr>
+          <w:sz w:val="22"/>
+        </w:rPr>
+        <w:t xml:space="preserve">If any of the above tools are missing from your machine, refer to the installation instructions at: https://github.com/AishaDarga/LAB-2490/blob/main/README.md</w:t>
+      </w:r>
+    </w:p>
+    <w:p>
+      <w:pPr>
+        <w:pStyle w:val="Heading2"/>
+        <w:spacing w:before="280" w:after="120"/>
+      </w:pPr>
+      <w:r>
+        <w:rPr>
+          <w:b/>
+          <w:color w:val="2E74B5"/>
+          <w:sz w:val="26"/>
+        </w:rPr>
+        <w:t xml:space="preserve">Your Unique ID (30 students share this cluster)</w:t>
+      </w:r>
+    </w:p>
+    <w:p>
+      <w:pPr>
+        <w:pStyle w:val="Normal"/>
+        <w:spacing w:after="120"/>
+      </w:pPr>
+      <w:r>
+        <w:rPr>
+          <w:sz w:val="22"/>
+        </w:rPr>
+        <w:t xml:space="preserve">Your unique numeric ID is printed on the card placed on your desk. Use that number wherever you see &lt;YOUR-ID&gt; in this guide — it ensures your resources do not collide with other students on the shared cluster.</w:t>
+      </w:r>
+    </w:p>
     <w:p>
       <w:pPr>
         <w:pStyle w:val="Normal"/>
@@ -431,9 +607,34 @@
           <w:color w:val="7F6000"/>
           <w:sz w:val="20"/>
         </w:rPr>
-        <w:t xml:space="preserve">NOTE: If your token has expired, log in to the OpenShift web console → click your username (top-right) → Copy login command → Display Token. Use the token shown there.</w:t>
-      </w:r>
-    </w:p>
+        <w:t xml:space="preserve">IMPORTANT: Your ID is on your desk card — use it exactly as printed. Replace every &lt;YOUR-ID&gt; in the commands below with that number. For example, if your card says 07, your namespace is robot-shop-07 and your Helm release is robot-shop-07.</w:t>
+      </w:r>
+    </w:p>
+    <w:tbl>
+      <w:tblPr>
+        <w:tblW w:w="2500" w:type="pct"/>
+        <w:tblBorders>
+          <w:top w:val="single" w:sz="4"/>
+          <w:left w:val="single" w:sz="4"/>
+          <w:bottom w:val="single" w:sz="4"/>
+          <w:right w:val="single" w:sz="4"/>
+          <w:insideH w:val="single" w:sz="4"/>
+          <w:insideV w:val="single" w:sz="4"/>
+        </w:tblBorders>
+      </w:tblPr>
+      <w:tblGrid>
+        <w:gridCol w:w="4153"/>
+        <w:gridCol w:w="4153"/>
+      </w:tblGrid>
+      <w:tr>
+        <w:tc>
+          <w:p/>
+        </w:tc>
+        <w:tc>
+          <w:p/>
+        </w:tc>
+      </w:tr>
+    </w:tbl>
     <w:p>
       <w:pPr>
         <w:pStyle w:val="Heading1"/>
@@ -466,13 +667,13 @@
     <w:p>
       <w:pPr>
         <w:pStyle w:val="Normal"/>
-        <w:spacing w:after="120"/>
-      </w:pPr>
-      <w:r>
-        <w:rPr>
-          <w:sz w:val="22"/>
-        </w:rPr>
-        <w:t xml:space="preserve">Open a terminal and run the following command to authenticate against the TechZone cluster:</w:t>
+        <w:spacing w:after="80"/>
+      </w:pPr>
+      <w:r>
+        <w:rPr>
+          <w:sz w:val="22"/>
+        </w:rPr>
+        <w:t xml:space="preserve">Option A (recommended) — paste the complete command copied from the browser in "Before You Start" Step 5. It already contains your token and server URL, so you can run it as-is:</w:t>
       </w:r>
     </w:p>
     <w:p>
@@ -486,9 +687,20 @@
           <w:rFonts w:ascii="Courier New" w:hAnsi="Courier New" w:eastAsia="Courier New"/>
           <w:b w:val="false"/>
           <w:color w:val="D0E7FF"/>
-          <w:sz w:val="18"/>
-        </w:rPr>
-        <w:t xml:space="preserve">oc login --token=sha256~bgSlQPxBYIiLOwXofwHmkAWZXx6r5BqJIAC0AzIJKTs --server=https://api.itz-t53413.hub01-lb.techzone.ibm.com:6443 --insecure-skip-tls-verify=true</w:t>
+          <w:sz w:val="22"/>
+        </w:rPr>
+        <w:t xml:space="preserve">oc login --token=&lt;YOUR-TOKEN&gt; --server=&lt;YOUR-API-SERVER-URL&gt; --insecure-skip-tls-verify=true</w:t>
+      </w:r>
+    </w:p>
+    <w:p>
+      <w:pPr>
+        <w:spacing w:after="160"/>
+      </w:pPr>
+      <w:r>
+        <w:rPr>
+          <w:sz w:val="22"/>
+        </w:rPr>
+        <w:t xml:space="preserve">Option B — if you need to build the command manually, your token is the sha256~... string shown under "Your API token is" on the Display Token page, and the server URL is the --server= value shown in the same "Log in with this token" box.</w:t>
       </w:r>
     </w:p>
     <w:p>
@@ -507,7 +719,7 @@
           <w:color w:val="375623"/>
           <w:sz w:val="20"/>
         </w:rPr>
-        <w:t xml:space="preserve">Expected output: Logged into "..." as "kube:admin" using the token provided.</w:t>
+        <w:t xml:space="preserve">Expected output: Logged into "&lt;server&gt;" as "&lt;your-username&gt;" using the token provided.</w:t>
       </w:r>
     </w:p>
     <w:p>
@@ -523,14 +735,6 @@
         <w:shd w:val="clear" w:fill="DEEAF1"/>
         <w:spacing w:before="200" w:after="200"/>
       </w:pPr>
-      <w:r>
-        <w:rPr>
-          <w:b/>
-          <w:color w:val="1F3864"/>
-          <w:sz w:val="20"/>
-        </w:rPr>
-        <w:t xml:space="preserve">[ SCREENSHOT — Terminal showing successful oc login output ]</w:t>
-      </w:r>
     </w:p>
     <w:p>
       <w:pPr>
@@ -1871,7 +2075,7 @@
           <w:color w:val="2E74B5"/>
           <w:sz w:val="26"/>
         </w:rPr>
-        <w:t xml:space="preserve">Step 1 — Add the Kubernetes Target</w:t>
+        <w:t xml:space="preserve">Step 1 — Open the Turbonomic UI</w:t>
       </w:r>
     </w:p>
     <w:p>
@@ -1883,12 +2087,12 @@
         <w:rPr>
           <w:sz w:val="22"/>
         </w:rPr>
-        <w:t xml:space="preserve">In the Turbonomic UI navigate to Settings → Target Configuration → Add Target → Kubernetes. Enter your cluster API URL and a service account token with read access to the robot-shop namespace.</w:t>
-      </w:r>
-    </w:p>
-    <w:p>
-      <w:pPr>
-        <w:pStyle w:val="Normal"/>
+        <w:t xml:space="preserve">Open the Turbonomic UI URL from LiveNote in your browser and log in with the credentials provided.</w:t>
+      </w:r>
+    </w:p>
+    <w:p>
+      <w:pPr>
+        <w:pStyle w:val="Heading2"/>
         <w:pBdr>
           <w:top w:val="single" w:color="9DC3E6" w:sz="4" w:space="4"/>
           <w:left w:val="single" w:color="9DC3E6" w:sz="4" w:space="4"/>
@@ -1903,9 +2107,9 @@
         <w:rPr>
           <w:b/>
           <w:color w:val="1F3864"/>
-          <w:sz w:val="20"/>
-        </w:rPr>
-        <w:t xml:space="preserve">[ SCREENSHOT — Turbonomic Target Configuration showing the connected Kubernetes cluster ]</w:t>
+          <w:sz w:val="26"/>
+        </w:rPr>
+        <w:t xml:space="preserve">Step 2 — Find your application by namespace</w:t>
       </w:r>
     </w:p>
     <w:p>
@@ -1917,9 +2121,9 @@
         <w:rPr>
           <w:b/>
           <w:color w:val="2E74B5"/>
-          <w:sz w:val="26"/>
-        </w:rPr>
-        <w:t xml:space="preserve">Step 2 — Navigate to the Application Perspective</w:t>
+          <w:sz w:val="22"/>
+        </w:rPr>
+        <w:t xml:space="preserve">In the left sidebar, click Search. In the search bar, type robot-shop-&lt;YOUR-ID&gt; to find your namespace.</w:t>
       </w:r>
     </w:p>
     <w:p>
@@ -1931,7 +2135,7 @@
         <w:rPr>
           <w:sz w:val="22"/>
         </w:rPr>
-        <w:t xml:space="preserve">The Optimizations tab only appears inside an Application Perspective, not at the top-level dashboard. In Turbonomic, navigate to:</w:t>
+        <w:t xml:space="preserve">Alternatively, navigate to On-Prem → Namespaces and scroll to locate robot-shop-&lt;YOUR-ID&gt; in the list.</w:t>
       </w:r>
     </w:p>
     <w:p>
@@ -1943,12 +2147,12 @@
         <w:rPr>
           <w:sz w:val="22"/>
         </w:rPr>
-        <w:t xml:space="preserve">Search → type Robot Shop &lt;YOUR-ID&gt; → select your Robot Shop application → click the Optimizations tab.</w:t>
-      </w:r>
-    </w:p>
-    <w:p>
-      <w:pPr>
-        <w:pStyle w:val="Normal"/>
+        <w:t xml:space="preserve">Click on your namespace to open the workload view. You will see all the containers and services running in your Robot Shop deployment.</w:t>
+      </w:r>
+    </w:p>
+    <w:p>
+      <w:pPr>
+        <w:pStyle w:val="Heading2"/>
         <w:pBdr>
           <w:top w:val="single" w:color="9DC3E6" w:sz="4" w:space="4"/>
           <w:left w:val="single" w:color="9DC3E6" w:sz="4" w:space="4"/>
@@ -1963,35 +2167,71 @@
         <w:rPr>
           <w:b/>
           <w:color w:val="1F3864"/>
-          <w:sz w:val="20"/>
-        </w:rPr>
-        <w:t xml:space="preserve">[ SCREENSHOT — Turbonomic Optimizations tab showing Robot Shop workload recommendations ]</w:t>
+          <w:sz w:val="26"/>
+        </w:rPr>
+        <w:t xml:space="preserve">Step 3 — Review Recommendations</w:t>
       </w:r>
     </w:p>
     <w:p>
       <w:pPr>
         <w:pStyle w:val="Heading2"/>
-        <w:spacing w:before="280" w:after="120"/>
+        <w:spacing w:before="280" w:after="80"/>
       </w:pPr>
       <w:r>
         <w:rPr>
           <w:b/>
           <w:color w:val="2E74B5"/>
-          <w:sz w:val="26"/>
-        </w:rPr>
-        <w:t xml:space="preserve">Step 3 — Review and Action Recommendations</w:t>
-      </w:r>
-    </w:p>
-    <w:p>
-      <w:pPr>
-        <w:pStyle w:val="Normal"/>
+          <w:sz w:val="22"/>
+        </w:rPr>
+        <w:t xml:space="preserve">Turbonomic will show resource optimisation recommendations for your workload such as:</w:t>
+      </w:r>
+    </w:p>
+    <w:p>
+      <w:pPr>
+        <w:pStyle w:val="Normal"/>
+        <w:numPr>
+          <w:ilvl w:val="0"/>
+          <w:numId w:val="8"/>
+        </w:numPr>
+        <w:spacing w:after="80"/>
+      </w:pPr>
+      <w:r>
+        <w:rPr>
+          <w:sz w:val="22"/>
+        </w:rPr>
+        <w:t xml:space="preserve">Resize container CPU/memory limits — based on actual utilisation vs requested</w:t>
+      </w:r>
+    </w:p>
+    <w:p>
+      <w:pPr>
+        <w:pStyle w:val="Normal"/>
+        <w:numPr>
+          <w:ilvl w:val="0"/>
+          <w:numId w:val="8"/>
+        </w:numPr>
+        <w:spacing w:after="80"/>
+      </w:pPr>
+      <w:r>
+        <w:rPr>
+          <w:sz w:val="22"/>
+        </w:rPr>
+        <w:t xml:space="preserve">Scale pod count — based on queue depth and latency thresholds</w:t>
+      </w:r>
+    </w:p>
+    <w:p>
+      <w:pPr>
+        <w:pStyle w:val="Normal"/>
+        <w:numPr>
+          <w:ilvl w:val="0"/>
+          <w:numId w:val="8"/>
+        </w:numPr>
         <w:spacing w:after="120"/>
       </w:pPr>
       <w:r>
         <w:rPr>
           <w:sz w:val="22"/>
         </w:rPr>
-        <w:t xml:space="preserve">Turbonomic will surface recommendations such as:</w:t>
+        <w:t xml:space="preserve">Move workloads — to reduce co-location pressure on nodes</w:t>
       </w:r>
     </w:p>
     <w:p>
@@ -2001,57 +2241,13 @@
           <w:ilvl w:val="0"/>
           <w:numId w:val="5"/>
         </w:numPr>
-        <w:spacing w:after="80"/>
-      </w:pPr>
-      <w:r>
-        <w:rPr>
-          <w:sz w:val="22"/>
-        </w:rPr>
-        <w:t xml:space="preserve">Resize container CPU/memory limits — based on actual utilisation vs requested</w:t>
-      </w:r>
-    </w:p>
-    <w:p>
-      <w:pPr>
-        <w:pStyle w:val="Normal"/>
-        <w:numPr>
-          <w:ilvl w:val="0"/>
-          <w:numId w:val="5"/>
-        </w:numPr>
-        <w:spacing w:after="80"/>
-      </w:pPr>
-      <w:r>
-        <w:rPr>
-          <w:sz w:val="22"/>
-        </w:rPr>
-        <w:t xml:space="preserve">Scale pod count — based on queue depth and latency thresholds</w:t>
-      </w:r>
-    </w:p>
-    <w:p>
-      <w:pPr>
-        <w:pStyle w:val="Normal"/>
-        <w:numPr>
-          <w:ilvl w:val="0"/>
-          <w:numId w:val="5"/>
-        </w:numPr>
-        <w:spacing w:after="120"/>
-      </w:pPr>
-      <w:r>
-        <w:rPr>
-          <w:sz w:val="22"/>
-        </w:rPr>
-        <w:t xml:space="preserve">Move workloads — to reduce co-location pressure on nodes</w:t>
-      </w:r>
-    </w:p>
-    <w:p>
-      <w:pPr>
-        <w:pStyle w:val="Normal"/>
-        <w:spacing w:after="320"/>
-      </w:pPr>
-      <w:r>
-        <w:rPr>
-          <w:sz w:val="22"/>
-        </w:rPr>
-        <w:t xml:space="preserve">Review each recommendation. In a live environment you would click Execute to apply the action. In this lab environment, note the reasoning and projected impact shown for each recommendation.</w:t>
+        <w:spacing w:after="160"/>
+      </w:pPr>
+      <w:r>
+        <w:rPr>
+          <w:sz w:val="22"/>
+        </w:rPr>
+        <w:t xml:space="preserve">Review each recommendation. Note the reasoning and projected impact shown. In this lab you are observing only — no actions need to be executed.</w:t>
       </w:r>
     </w:p>
     <w:p>
@@ -2066,7 +2262,7 @@
           <w:color w:val="FFFFFF"/>
           <w:sz w:val="36"/>
         </w:rPr>
-        <w:t xml:space="preserve">Phase 5 — Cost Management with IBM Cloudability</w:t>
+        <w:t xml:space="preserve">Phase 5 — Cost Management with IBM Cloudability (Optional)</w:t>
       </w:r>
     </w:p>
     <w:p>
@@ -2078,7 +2274,7 @@
         <w:rPr>
           <w:sz w:val="22"/>
         </w:rPr>
-        <w:t xml:space="preserve">IBM Cloudability provides FinOps-grade cloud cost visibility. It reads the same cloud billing data as Turbonomic and surfaces cost waste, usage trends, and budget forecasts.</w:t>
+        <w:t xml:space="preserve">This phase is optional — complete it if time permits after finishing Phases 1–4. IBM Cloudability provides FinOps-grade cloud cost visibility. It reads the same cloud billing data as Turbonomic and surfaces cost waste, usage trends, and budget forecasts.</w:t>
       </w:r>
     </w:p>
     <w:p>
@@ -3106,6 +3302,174 @@
       </w:pPr>
     </w:lvl>
   </w:abstractNum>
+  <w:abstractNum w:abstractNumId="6">
+    <w:multiLevelType w:val="hybridMultilevel"/>
+    <w:lvl w:ilvl="0">
+      <w:start w:val="1"/>
+      <w:numFmt w:val="bullet"/>
+      <w:lvlText w:val="•"/>
+      <w:lvlJc w:val="left"/>
+      <w:pPr>
+        <w:ind w:left="720" w:hanging="360"/>
+      </w:pPr>
+    </w:lvl>
+    <w:lvl w:ilvl="1">
+      <w:start w:val="1"/>
+      <w:numFmt w:val="bullet"/>
+      <w:lvlText w:val="◦"/>
+      <w:lvlJc w:val="left"/>
+      <w:pPr>
+        <w:ind w:left="1440" w:hanging="360"/>
+      </w:pPr>
+    </w:lvl>
+    <w:lvl w:ilvl="2">
+      <w:start w:val="1"/>
+      <w:numFmt w:val="bullet"/>
+      <w:lvlText w:val="▪"/>
+      <w:lvlJc w:val="left"/>
+      <w:pPr>
+        <w:ind w:left="2160" w:hanging="360"/>
+      </w:pPr>
+    </w:lvl>
+    <w:lvl w:ilvl="3">
+      <w:start w:val="1"/>
+      <w:numFmt w:val="bullet"/>
+      <w:lvlText w:val="•"/>
+      <w:lvlJc w:val="left"/>
+      <w:pPr>
+        <w:ind w:left="2880" w:hanging="360"/>
+      </w:pPr>
+    </w:lvl>
+    <w:lvl w:ilvl="4">
+      <w:start w:val="1"/>
+      <w:numFmt w:val="bullet"/>
+      <w:lvlText w:val="◦"/>
+      <w:lvlJc w:val="left"/>
+      <w:pPr>
+        <w:ind w:left="3600" w:hanging="360"/>
+      </w:pPr>
+    </w:lvl>
+    <w:lvl w:ilvl="5">
+      <w:start w:val="1"/>
+      <w:numFmt w:val="bullet"/>
+      <w:lvlText w:val="▪"/>
+      <w:lvlJc w:val="left"/>
+      <w:pPr>
+        <w:ind w:left="4320" w:hanging="360"/>
+      </w:pPr>
+    </w:lvl>
+    <w:lvl w:ilvl="6">
+      <w:start w:val="1"/>
+      <w:numFmt w:val="bullet"/>
+      <w:lvlText w:val="•"/>
+      <w:lvlJc w:val="left"/>
+      <w:pPr>
+        <w:ind w:left="5040" w:hanging="360"/>
+      </w:pPr>
+    </w:lvl>
+    <w:lvl w:ilvl="7">
+      <w:start w:val="1"/>
+      <w:numFmt w:val="bullet"/>
+      <w:lvlText w:val="◦"/>
+      <w:lvlJc w:val="left"/>
+      <w:pPr>
+        <w:ind w:left="5760" w:hanging="360"/>
+      </w:pPr>
+    </w:lvl>
+    <w:lvl w:ilvl="8">
+      <w:start w:val="1"/>
+      <w:numFmt w:val="bullet"/>
+      <w:lvlText w:val="▪"/>
+      <w:lvlJc w:val="left"/>
+      <w:pPr>
+        <w:ind w:left="6480" w:hanging="360"/>
+      </w:pPr>
+    </w:lvl>
+  </w:abstractNum>
+  <w:abstractNum w:abstractNumId="7">
+    <w:multiLevelType w:val="hybridMultilevel"/>
+    <w:lvl w:ilvl="0">
+      <w:start w:val="1"/>
+      <w:numFmt w:val="bullet"/>
+      <w:lvlText w:val="•"/>
+      <w:lvlJc w:val="left"/>
+      <w:pPr>
+        <w:ind w:left="720" w:hanging="360"/>
+      </w:pPr>
+    </w:lvl>
+    <w:lvl w:ilvl="1">
+      <w:start w:val="1"/>
+      <w:numFmt w:val="bullet"/>
+      <w:lvlText w:val="◦"/>
+      <w:lvlJc w:val="left"/>
+      <w:pPr>
+        <w:ind w:left="1440" w:hanging="360"/>
+      </w:pPr>
+    </w:lvl>
+    <w:lvl w:ilvl="2">
+      <w:start w:val="1"/>
+      <w:numFmt w:val="bullet"/>
+      <w:lvlText w:val="▪"/>
+      <w:lvlJc w:val="left"/>
+      <w:pPr>
+        <w:ind w:left="2160" w:hanging="360"/>
+      </w:pPr>
+    </w:lvl>
+    <w:lvl w:ilvl="3">
+      <w:start w:val="1"/>
+      <w:numFmt w:val="bullet"/>
+      <w:lvlText w:val="•"/>
+      <w:lvlJc w:val="left"/>
+      <w:pPr>
+        <w:ind w:left="2880" w:hanging="360"/>
+      </w:pPr>
+    </w:lvl>
+    <w:lvl w:ilvl="4">
+      <w:start w:val="1"/>
+      <w:numFmt w:val="bullet"/>
+      <w:lvlText w:val="◦"/>
+      <w:lvlJc w:val="left"/>
+      <w:pPr>
+        <w:ind w:left="3600" w:hanging="360"/>
+      </w:pPr>
+    </w:lvl>
+    <w:lvl w:ilvl="5">
+      <w:start w:val="1"/>
+      <w:numFmt w:val="bullet"/>
+      <w:lvlText w:val="▪"/>
+      <w:lvlJc w:val="left"/>
+      <w:pPr>
+        <w:ind w:left="4320" w:hanging="360"/>
+      </w:pPr>
+    </w:lvl>
+    <w:lvl w:ilvl="6">
+      <w:start w:val="1"/>
+      <w:numFmt w:val="bullet"/>
+      <w:lvlText w:val="•"/>
+      <w:lvlJc w:val="left"/>
+      <w:pPr>
+        <w:ind w:left="5040" w:hanging="360"/>
+      </w:pPr>
+    </w:lvl>
+    <w:lvl w:ilvl="7">
+      <w:start w:val="1"/>
+      <w:numFmt w:val="bullet"/>
+      <w:lvlText w:val="◦"/>
+      <w:lvlJc w:val="left"/>
+      <w:pPr>
+        <w:ind w:left="5760" w:hanging="360"/>
+      </w:pPr>
+    </w:lvl>
+    <w:lvl w:ilvl="8">
+      <w:start w:val="1"/>
+      <w:numFmt w:val="bullet"/>
+      <w:lvlText w:val="▪"/>
+      <w:lvlJc w:val="left"/>
+      <w:pPr>
+        <w:ind w:left="6480" w:hanging="360"/>
+      </w:pPr>
+    </w:lvl>
+  </w:abstractNum>
   <w:num w:numId="1">
     <w:abstractNumId w:val="0"/>
   </w:num>
@@ -3123,6 +3487,12 @@
   </w:num>
   <w:num w:numId="6">
     <w:abstractNumId w:val="5"/>
+  </w:num>
+  <w:num w:numId="7">
+    <w:abstractNumId w:val="6"/>
+  </w:num>
+  <w:num w:numId="8">
+    <w:abstractNumId w:val="7"/>
   </w:num>
 </w:numbering>
 </file>
@@ -3184,6 +3554,27 @@
       <w:color w:val="2F5496"/>
       <w:sz w:val="26"/>
       <w:szCs w:val="26"/>
+    </w:rPr>
+  </w:style>
+  <w:style w:type="paragraph" w:styleId="Heading3">
+    <w:name w:val="heading 3"/>
+    <w:basedOn w:val="Normal"/>
+    <w:next w:val="Normal"/>
+    <w:uiPriority w:val="9"/>
+    <w:semiHidden/>
+    <w:unhideWhenUsed/>
+    <w:qFormat/>
+    <w:pPr>
+      <w:keepNext/>
+      <w:keepLines/>
+      <w:spacing w:before="40" w:after="0"/>
+      <w:outlineLvl w:val="2"/>
+    </w:pPr>
+    <w:rPr>
+      <w:rFonts w:asciiTheme="majorHAnsi" w:hAnsiTheme="majorHAnsi" w:eastAsiaTheme="majorEastAsia" w:cstheme="majorBidi"/>
+      <w:color w:val="1F3763"/>
+      <w:sz w:val="24"/>
+      <w:szCs w:val="24"/>
     </w:rPr>
   </w:style>
 </w:styles>

</xml_diff>